<commit_message>
Fixes en adr para que cumplan con lo que esta en el codigo, arreglo de lanzamiento en windows y manejo de caida de nodos
</commit_message>
<xml_diff>
--- a/informe/Informe-Final-Centinela-Urbano.docx
+++ b/informe/Informe-Final-Centinela-Urbano.docx
@@ -807,7 +807,7 @@
             <w:tab/>
           </w:r>
           <w:r>
-            <w:t>8</w:t>
+            <w:t>9</w:t>
           </w:r>
         </w:p>
         <w:p>
@@ -969,7 +969,7 @@
             <w:tab/>
           </w:r>
           <w:r>
-            <w:t>18</w:t>
+            <w:t>19</w:t>
           </w:r>
         </w:p>
         <w:p>
@@ -987,7 +987,7 @@
             <w:tab/>
           </w:r>
           <w:r>
-            <w:t>19</w:t>
+            <w:t>20</w:t>
           </w:r>
         </w:p>
         <w:p>
@@ -1005,7 +1005,7 @@
             <w:tab/>
           </w:r>
           <w:r>
-            <w:t>20</w:t>
+            <w:t>21</w:t>
           </w:r>
         </w:p>
         <w:p>
@@ -1023,7 +1023,7 @@
             <w:tab/>
           </w:r>
           <w:r>
-            <w:t>20</w:t>
+            <w:t>22</w:t>
           </w:r>
         </w:p>
         <w:p>
@@ -1041,7 +1041,7 @@
             <w:tab/>
           </w:r>
           <w:r>
-            <w:t>21</w:t>
+            <w:t>22</w:t>
           </w:r>
         </w:p>
         <w:p>
@@ -1059,7 +1059,7 @@
             <w:tab/>
           </w:r>
           <w:r>
-            <w:t>22</w:t>
+            <w:t>24</w:t>
           </w:r>
         </w:p>
         <w:p>
@@ -1077,7 +1077,7 @@
             <w:tab/>
           </w:r>
           <w:r>
-            <w:t>23</w:t>
+            <w:t>25</w:t>
           </w:r>
         </w:p>
         <w:p>
@@ -1095,7 +1095,7 @@
             <w:tab/>
           </w:r>
           <w:r>
-            <w:t>25</w:t>
+            <w:t>26</w:t>
           </w:r>
         </w:p>
         <w:p>
@@ -1113,7 +1113,7 @@
             <w:tab/>
           </w:r>
           <w:r>
-            <w:t>27</w:t>
+            <w:t>28</w:t>
           </w:r>
         </w:p>
         <w:p>
@@ -2717,9 +2717,9 @@
       </w:tblPr>
       <w:tblGrid>
         <w:gridCol w:w="768"/>
-        <w:gridCol w:w="2426"/>
-        <w:gridCol w:w="4241"/>
-        <w:gridCol w:w="1925"/>
+        <w:gridCol w:w="2378"/>
+        <w:gridCol w:w="4088"/>
+        <w:gridCol w:w="2126"/>
       </w:tblGrid>
       <w:tr>
         <w:trPr>
@@ -2760,7 +2760,7 @@
         </w:tc>
         <w:tc>
           <w:tcPr>
-            <w:tcW w:type="dxa" w:w="2426"/>
+            <w:tcW w:type="dxa" w:w="2378"/>
             <w:tcBorders>
               <w:top w:val="single" w:color="000000" w:sz="8"/>
               <w:left w:val="none" w:color="FFFFFF" w:sz="0"/>
@@ -2793,7 +2793,7 @@
         </w:tc>
         <w:tc>
           <w:tcPr>
-            <w:tcW w:type="dxa" w:w="4241"/>
+            <w:tcW w:type="dxa" w:w="4088"/>
             <w:tcBorders>
               <w:top w:val="single" w:color="000000" w:sz="8"/>
               <w:left w:val="none" w:color="FFFFFF" w:sz="0"/>
@@ -2826,7 +2826,7 @@
         </w:tc>
         <w:tc>
           <w:tcPr>
-            <w:tcW w:type="dxa" w:w="1925"/>
+            <w:tcW w:type="dxa" w:w="2126"/>
             <w:tcBorders>
               <w:top w:val="single" w:color="000000" w:sz="8"/>
               <w:left w:val="none" w:color="FFFFFF" w:sz="0"/>
@@ -2853,7 +2853,7 @@
                 <w:sz w:val="20"/>
                 <w:szCs w:val="20"/>
               </w:rPr>
-              <w:t xml:space="preserve">SO recomendado</w:t>
+              <w:t xml:space="preserve">Sistema operativo</w:t>
             </w:r>
           </w:p>
         </w:tc>
@@ -2897,7 +2897,7 @@
         </w:tc>
         <w:tc>
           <w:tcPr>
-            <w:tcW w:type="dxa" w:w="2426"/>
+            <w:tcW w:type="dxa" w:w="2378"/>
             <w:tcBorders>
               <w:top w:val="none" w:color="FFFFFF" w:sz="0"/>
               <w:left w:val="none" w:color="FFFFFF" w:sz="0"/>
@@ -2930,67 +2930,67 @@
         </w:tc>
         <w:tc>
           <w:tcPr>
-            <w:tcW w:type="dxa" w:w="4241"/>
-            <w:tcBorders>
-              <w:top w:val="none" w:color="FFFFFF" w:sz="0"/>
-              <w:left w:val="none" w:color="FFFFFF" w:sz="0"/>
-              <w:bottom w:val="none" w:color="FFFFFF" w:sz="0"/>
-              <w:right w:val="none" w:color="FFFFFF" w:sz="0"/>
-            </w:tcBorders>
-            <w:tcMar>
-              <w:top w:type="dxa" w:w="60"/>
-              <w:left w:type="dxa" w:w="80"/>
-              <w:bottom w:type="dxa" w:w="60"/>
-              <w:right w:type="dxa" w:w="80"/>
-            </w:tcMar>
-            <w:vAlign w:val="top"/>
-          </w:tcPr>
-          <w:p>
-            <w:pPr>
-              <w:keepNext w:val="false"/>
-              <w:spacing w:after="0" w:line="240" w:lineRule="auto"/>
-            </w:pPr>
-            <w:r>
-              <w:rPr>
-                <w:b w:val="false"/>
-                <w:bCs w:val="false"/>
-                <w:sz w:val="20"/>
-                <w:szCs w:val="20"/>
-              </w:rPr>
-              <w:t xml:space="preserve">Kafka 3.9 (KRaft), TimescaleDB 2.17 (PostgreSQL 16), Redis 7.4</w:t>
-            </w:r>
-          </w:p>
-        </w:tc>
-        <w:tc>
-          <w:tcPr>
-            <w:tcW w:type="dxa" w:w="1925"/>
-            <w:tcBorders>
-              <w:top w:val="none" w:color="FFFFFF" w:sz="0"/>
-              <w:left w:val="none" w:color="FFFFFF" w:sz="0"/>
-              <w:bottom w:val="none" w:color="FFFFFF" w:sz="0"/>
-              <w:right w:val="none" w:color="FFFFFF" w:sz="0"/>
-            </w:tcBorders>
-            <w:tcMar>
-              <w:top w:type="dxa" w:w="60"/>
-              <w:left w:type="dxa" w:w="80"/>
-              <w:bottom w:type="dxa" w:w="60"/>
-              <w:right w:type="dxa" w:w="80"/>
-            </w:tcMar>
-            <w:vAlign w:val="top"/>
-          </w:tcPr>
-          <w:p>
-            <w:pPr>
-              <w:keepNext w:val="false"/>
-              <w:spacing w:after="0" w:line="240" w:lineRule="auto"/>
-            </w:pPr>
-            <w:r>
-              <w:rPr>
-                <w:b w:val="false"/>
-                <w:bCs w:val="false"/>
-                <w:sz w:val="20"/>
-                <w:szCs w:val="20"/>
-              </w:rPr>
-              <w:t xml:space="preserve">Ubuntu Server 22.04</w:t>
+            <w:tcW w:type="dxa" w:w="4088"/>
+            <w:tcBorders>
+              <w:top w:val="none" w:color="FFFFFF" w:sz="0"/>
+              <w:left w:val="none" w:color="FFFFFF" w:sz="0"/>
+              <w:bottom w:val="none" w:color="FFFFFF" w:sz="0"/>
+              <w:right w:val="none" w:color="FFFFFF" w:sz="0"/>
+            </w:tcBorders>
+            <w:tcMar>
+              <w:top w:type="dxa" w:w="60"/>
+              <w:left w:type="dxa" w:w="80"/>
+              <w:bottom w:type="dxa" w:w="60"/>
+              <w:right w:type="dxa" w:w="80"/>
+            </w:tcMar>
+            <w:vAlign w:val="top"/>
+          </w:tcPr>
+          <w:p>
+            <w:pPr>
+              <w:keepNext w:val="false"/>
+              <w:spacing w:after="0" w:line="240" w:lineRule="auto"/>
+            </w:pPr>
+            <w:r>
+              <w:rPr>
+                <w:b w:val="false"/>
+                <w:bCs w:val="false"/>
+                <w:sz w:val="20"/>
+                <w:szCs w:val="20"/>
+              </w:rPr>
+              <w:t xml:space="preserve">Kafka 3.9 (KRaft), TimescaleDB 2.17 (PostgreSQL 16), Redis 7.4 y respaldo programado de la base</w:t>
+            </w:r>
+          </w:p>
+        </w:tc>
+        <w:tc>
+          <w:tcPr>
+            <w:tcW w:type="dxa" w:w="2126"/>
+            <w:tcBorders>
+              <w:top w:val="none" w:color="FFFFFF" w:sz="0"/>
+              <w:left w:val="none" w:color="FFFFFF" w:sz="0"/>
+              <w:bottom w:val="none" w:color="FFFFFF" w:sz="0"/>
+              <w:right w:val="none" w:color="FFFFFF" w:sz="0"/>
+            </w:tcBorders>
+            <w:tcMar>
+              <w:top w:type="dxa" w:w="60"/>
+              <w:left w:type="dxa" w:w="80"/>
+              <w:bottom w:type="dxa" w:w="60"/>
+              <w:right w:type="dxa" w:w="80"/>
+            </w:tcMar>
+            <w:vAlign w:val="top"/>
+          </w:tcPr>
+          <w:p>
+            <w:pPr>
+              <w:keepNext w:val="false"/>
+              <w:spacing w:after="0" w:line="240" w:lineRule="auto"/>
+            </w:pPr>
+            <w:r>
+              <w:rPr>
+                <w:b w:val="false"/>
+                <w:bCs w:val="false"/>
+                <w:sz w:val="20"/>
+                <w:szCs w:val="20"/>
+              </w:rPr>
+              <w:t xml:space="preserve">Windows 10/11 con Docker Desktop</w:t>
             </w:r>
           </w:p>
         </w:tc>
@@ -3034,7 +3034,7 @@
         </w:tc>
         <w:tc>
           <w:tcPr>
-            <w:tcW w:type="dxa" w:w="2426"/>
+            <w:tcW w:type="dxa" w:w="2378"/>
             <w:tcBorders>
               <w:top w:val="none" w:color="FFFFFF" w:sz="0"/>
               <w:left w:val="none" w:color="FFFFFF" w:sz="0"/>
@@ -3067,7 +3067,7 @@
         </w:tc>
         <w:tc>
           <w:tcPr>
-            <w:tcW w:type="dxa" w:w="4241"/>
+            <w:tcW w:type="dxa" w:w="4088"/>
             <w:tcBorders>
               <w:top w:val="none" w:color="FFFFFF" w:sz="0"/>
               <w:left w:val="none" w:color="FFFFFF" w:sz="0"/>
@@ -3100,34 +3100,34 @@
         </w:tc>
         <w:tc>
           <w:tcPr>
-            <w:tcW w:type="dxa" w:w="1925"/>
-            <w:tcBorders>
-              <w:top w:val="none" w:color="FFFFFF" w:sz="0"/>
-              <w:left w:val="none" w:color="FFFFFF" w:sz="0"/>
-              <w:bottom w:val="none" w:color="FFFFFF" w:sz="0"/>
-              <w:right w:val="none" w:color="FFFFFF" w:sz="0"/>
-            </w:tcBorders>
-            <w:tcMar>
-              <w:top w:type="dxa" w:w="60"/>
-              <w:left w:type="dxa" w:w="80"/>
-              <w:bottom w:type="dxa" w:w="60"/>
-              <w:right w:type="dxa" w:w="80"/>
-            </w:tcMar>
-            <w:vAlign w:val="top"/>
-          </w:tcPr>
-          <w:p>
-            <w:pPr>
-              <w:keepNext w:val="false"/>
-              <w:spacing w:after="0" w:line="240" w:lineRule="auto"/>
-            </w:pPr>
-            <w:r>
-              <w:rPr>
-                <w:b w:val="false"/>
-                <w:bCs w:val="false"/>
-                <w:sz w:val="20"/>
-                <w:szCs w:val="20"/>
-              </w:rPr>
-              <w:t xml:space="preserve">macOS / Linux</w:t>
+            <w:tcW w:type="dxa" w:w="2126"/>
+            <w:tcBorders>
+              <w:top w:val="none" w:color="FFFFFF" w:sz="0"/>
+              <w:left w:val="none" w:color="FFFFFF" w:sz="0"/>
+              <w:bottom w:val="none" w:color="FFFFFF" w:sz="0"/>
+              <w:right w:val="none" w:color="FFFFFF" w:sz="0"/>
+            </w:tcBorders>
+            <w:tcMar>
+              <w:top w:type="dxa" w:w="60"/>
+              <w:left w:type="dxa" w:w="80"/>
+              <w:bottom w:type="dxa" w:w="60"/>
+              <w:right w:type="dxa" w:w="80"/>
+            </w:tcMar>
+            <w:vAlign w:val="top"/>
+          </w:tcPr>
+          <w:p>
+            <w:pPr>
+              <w:keepNext w:val="false"/>
+              <w:spacing w:after="0" w:line="240" w:lineRule="auto"/>
+            </w:pPr>
+            <w:r>
+              <w:rPr>
+                <w:b w:val="false"/>
+                <w:bCs w:val="false"/>
+                <w:sz w:val="20"/>
+                <w:szCs w:val="20"/>
+              </w:rPr>
+              <w:t xml:space="preserve">Windows 10/11 con Docker Desktop</w:t>
             </w:r>
           </w:p>
         </w:tc>
@@ -3171,7 +3171,7 @@
         </w:tc>
         <w:tc>
           <w:tcPr>
-            <w:tcW w:type="dxa" w:w="2426"/>
+            <w:tcW w:type="dxa" w:w="2378"/>
             <w:tcBorders>
               <w:top w:val="none" w:color="FFFFFF" w:sz="0"/>
               <w:left w:val="none" w:color="FFFFFF" w:sz="0"/>
@@ -3204,7 +3204,7 @@
         </w:tc>
         <w:tc>
           <w:tcPr>
-            <w:tcW w:type="dxa" w:w="4241"/>
+            <w:tcW w:type="dxa" w:w="4088"/>
             <w:tcBorders>
               <w:top w:val="none" w:color="FFFFFF" w:sz="0"/>
               <w:left w:val="none" w:color="FFFFFF" w:sz="0"/>
@@ -3231,13 +3231,13 @@
                 <w:sz w:val="20"/>
                 <w:szCs w:val="20"/>
               </w:rPr>
-              <w:t xml:space="preserve">sensor-simulator (zonas 1-6 y 7-12) e instancias adicionales de ingesta y correlación</w:t>
-            </w:r>
-          </w:p>
-        </w:tc>
-        <w:tc>
-          <w:tcPr>
-            <w:tcW w:type="dxa" w:w="1925"/>
+              <w:t xml:space="preserve">sensor-simulator (zonas 1-6 y 7-12), vigilante del nodo B e instancias adicionales de ingesta y correlación</w:t>
+            </w:r>
+          </w:p>
+        </w:tc>
+        <w:tc>
+          <w:tcPr>
+            <w:tcW w:type="dxa" w:w="2126"/>
             <w:tcBorders>
               <w:top w:val="none" w:color="FFFFFF" w:sz="0"/>
               <w:left w:val="none" w:color="FFFFFF" w:sz="0"/>
@@ -3264,7 +3264,7 @@
                 <w:sz w:val="20"/>
                 <w:szCs w:val="20"/>
               </w:rPr>
-              <w:t xml:space="preserve">Windows / Linux</w:t>
+              <w:t xml:space="preserve">Windows 10/11 con Docker Desktop</w:t>
             </w:r>
           </w:p>
         </w:tc>
@@ -3288,7 +3288,7 @@
           <w:sz w:val="20"/>
           <w:szCs w:val="20"/>
         </w:rPr>
-        <w:t xml:space="preserve">Cada nodo tiene su propio archivo Docker Compose en la carpeta deploy del repositorio. Elaboración propia.</w:t>
+        <w:t xml:space="preserve">Cada nodo tiene su propio archivo Docker Compose en la carpeta deploy del repositorio y se configura y levanta con el script centinela.cmd. En producción, el nodo A iría preferentemente sobre Linux de servidor sin cambiar los archivos. Elaboración propia.</w:t>
       </w:r>
     </w:p>
     <w:p>
@@ -3308,7 +3308,7 @@
         <w:jc w:val="both"/>
       </w:pPr>
       <w:r>
-        <w:t xml:space="preserve">Un requisito del grupo fue poder ejecutar el sistema en más de una máquina a la vez para distribuir la carga. Los </w:t>
+        <w:t xml:space="preserve">Como las computadoras del laboratorio usan Windows, todo el sistema se instala y se opera desde Windows con un único script (centinela.cmd) que no requiere más que Docker Desktop: configura cada nodo, abre los puertos en el firewall, detecta los puertos reservados por Hyper-V (el error 10013 de Windows) y elige otros libres, levanta los nodos en orden y permite simular caídas, consultar la cola de errores y respaldar la base. Un requisito del grupo fue poder ejecutar el sistema en más de una máquina a la vez para distribuir la carga. Los </w:t>
       </w:r>
       <w:r>
         <w:rPr>
@@ -3543,7 +3543,7 @@
                 <w:sz w:val="20"/>
                 <w:szCs w:val="20"/>
               </w:rPr>
-              <w:t xml:space="preserve">Emular los cinco sensores, escenarios, picos de carga, reproducción CSV, buffer en disco y validación automática de correlaciones</w:t>
+              <w:t xml:space="preserve">Emular los cinco sensores, escenarios, picos de carga, reproducción CSV, buffer en disco con escritura anticipada, validación automática de correlaciones y vigilancia del nodo B</w:t>
             </w:r>
           </w:p>
         </w:tc>
@@ -3647,7 +3647,7 @@
                 <w:sz w:val="20"/>
                 <w:szCs w:val="20"/>
               </w:rPr>
-              <w:t xml:space="preserve">Validación, normalización, seudonimización, deduplicación, cola de mensajes muertos y puerta de entrada REST para la aplicación móvil</w:t>
+              <w:t xml:space="preserve">Validación, normalización, seudonimización, deduplicación, cola de mensajes muertos y puerta de entrada REST con buffer en disco para la aplicación móvil</w:t>
             </w:r>
           </w:p>
         </w:tc>
@@ -3855,7 +3855,7 @@
                 <w:sz w:val="20"/>
                 <w:szCs w:val="20"/>
               </w:rPr>
-              <w:t xml:space="preserve">Persistencia, API REST, consola del operador en vivo, seguridad por roles y tareas periódicas</w:t>
+              <w:t xml:space="preserve">Persistencia, API REST, consola del operador en vivo, seguridad por roles y tareas periódicas, incluido el reproceso de la cola de mensajes muertos</w:t>
             </w:r>
           </w:p>
         </w:tc>
@@ -5547,9 +5547,9 @@
       </w:tblPr>
       <w:tblGrid>
         <w:gridCol w:w="625"/>
-        <w:gridCol w:w="2862"/>
-        <w:gridCol w:w="2862"/>
-        <w:gridCol w:w="3011"/>
+        <w:gridCol w:w="2993"/>
+        <w:gridCol w:w="2747"/>
+        <w:gridCol w:w="2995"/>
       </w:tblGrid>
       <w:tr>
         <w:trPr>
@@ -5590,7 +5590,7 @@
         </w:tc>
         <w:tc>
           <w:tcPr>
-            <w:tcW w:type="dxa" w:w="2862"/>
+            <w:tcW w:type="dxa" w:w="2993"/>
             <w:tcBorders>
               <w:top w:val="single" w:color="000000" w:sz="8"/>
               <w:left w:val="none" w:color="FFFFFF" w:sz="0"/>
@@ -5623,7 +5623,7 @@
         </w:tc>
         <w:tc>
           <w:tcPr>
-            <w:tcW w:type="dxa" w:w="2862"/>
+            <w:tcW w:type="dxa" w:w="2747"/>
             <w:tcBorders>
               <w:top w:val="single" w:color="000000" w:sz="8"/>
               <w:left w:val="none" w:color="FFFFFF" w:sz="0"/>
@@ -5656,7 +5656,7 @@
         </w:tc>
         <w:tc>
           <w:tcPr>
-            <w:tcW w:type="dxa" w:w="3011"/>
+            <w:tcW w:type="dxa" w:w="2995"/>
             <w:tcBorders>
               <w:top w:val="single" w:color="000000" w:sz="8"/>
               <w:left w:val="none" w:color="FFFFFF" w:sz="0"/>
@@ -5727,7 +5727,7 @@
         </w:tc>
         <w:tc>
           <w:tcPr>
-            <w:tcW w:type="dxa" w:w="2862"/>
+            <w:tcW w:type="dxa" w:w="2993"/>
             <w:tcBorders>
               <w:top w:val="none" w:color="FFFFFF" w:sz="0"/>
               <w:left w:val="none" w:color="FFFFFF" w:sz="0"/>
@@ -5760,7 +5760,7 @@
         </w:tc>
         <w:tc>
           <w:tcPr>
-            <w:tcW w:type="dxa" w:w="2862"/>
+            <w:tcW w:type="dxa" w:w="2747"/>
             <w:tcBorders>
               <w:top w:val="none" w:color="FFFFFF" w:sz="0"/>
               <w:left w:val="none" w:color="FFFFFF" w:sz="0"/>
@@ -5793,7 +5793,7 @@
         </w:tc>
         <w:tc>
           <w:tcPr>
-            <w:tcW w:type="dxa" w:w="3011"/>
+            <w:tcW w:type="dxa" w:w="2995"/>
             <w:tcBorders>
               <w:top w:val="none" w:color="FFFFFF" w:sz="0"/>
               <w:left w:val="none" w:color="FFFFFF" w:sz="0"/>
@@ -5864,7 +5864,7 @@
         </w:tc>
         <w:tc>
           <w:tcPr>
-            <w:tcW w:type="dxa" w:w="2862"/>
+            <w:tcW w:type="dxa" w:w="2993"/>
             <w:tcBorders>
               <w:top w:val="none" w:color="FFFFFF" w:sz="0"/>
               <w:left w:val="none" w:color="FFFFFF" w:sz="0"/>
@@ -5897,7 +5897,7 @@
         </w:tc>
         <w:tc>
           <w:tcPr>
-            <w:tcW w:type="dxa" w:w="2862"/>
+            <w:tcW w:type="dxa" w:w="2747"/>
             <w:tcBorders>
               <w:top w:val="none" w:color="FFFFFF" w:sz="0"/>
               <w:left w:val="none" w:color="FFFFFF" w:sz="0"/>
@@ -5930,7 +5930,7 @@
         </w:tc>
         <w:tc>
           <w:tcPr>
-            <w:tcW w:type="dxa" w:w="3011"/>
+            <w:tcW w:type="dxa" w:w="2995"/>
             <w:tcBorders>
               <w:top w:val="none" w:color="FFFFFF" w:sz="0"/>
               <w:left w:val="none" w:color="FFFFFF" w:sz="0"/>
@@ -6001,7 +6001,7 @@
         </w:tc>
         <w:tc>
           <w:tcPr>
-            <w:tcW w:type="dxa" w:w="2862"/>
+            <w:tcW w:type="dxa" w:w="2993"/>
             <w:tcBorders>
               <w:top w:val="none" w:color="FFFFFF" w:sz="0"/>
               <w:left w:val="none" w:color="FFFFFF" w:sz="0"/>
@@ -6034,7 +6034,7 @@
         </w:tc>
         <w:tc>
           <w:tcPr>
-            <w:tcW w:type="dxa" w:w="2862"/>
+            <w:tcW w:type="dxa" w:w="2747"/>
             <w:tcBorders>
               <w:top w:val="none" w:color="FFFFFF" w:sz="0"/>
               <w:left w:val="none" w:color="FFFFFF" w:sz="0"/>
@@ -6067,7 +6067,7 @@
         </w:tc>
         <w:tc>
           <w:tcPr>
-            <w:tcW w:type="dxa" w:w="3011"/>
+            <w:tcW w:type="dxa" w:w="2995"/>
             <w:tcBorders>
               <w:top w:val="none" w:color="FFFFFF" w:sz="0"/>
               <w:left w:val="none" w:color="FFFFFF" w:sz="0"/>
@@ -6138,7 +6138,7 @@
         </w:tc>
         <w:tc>
           <w:tcPr>
-            <w:tcW w:type="dxa" w:w="2862"/>
+            <w:tcW w:type="dxa" w:w="2993"/>
             <w:tcBorders>
               <w:top w:val="none" w:color="FFFFFF" w:sz="0"/>
               <w:left w:val="none" w:color="FFFFFF" w:sz="0"/>
@@ -6171,7 +6171,7 @@
         </w:tc>
         <w:tc>
           <w:tcPr>
-            <w:tcW w:type="dxa" w:w="2862"/>
+            <w:tcW w:type="dxa" w:w="2747"/>
             <w:tcBorders>
               <w:top w:val="none" w:color="FFFFFF" w:sz="0"/>
               <w:left w:val="none" w:color="FFFFFF" w:sz="0"/>
@@ -6204,34 +6204,34 @@
         </w:tc>
         <w:tc>
           <w:tcPr>
-            <w:tcW w:type="dxa" w:w="3011"/>
-            <w:tcBorders>
-              <w:top w:val="none" w:color="FFFFFF" w:sz="0"/>
-              <w:left w:val="none" w:color="FFFFFF" w:sz="0"/>
-              <w:bottom w:val="none" w:color="FFFFFF" w:sz="0"/>
-              <w:right w:val="none" w:color="FFFFFF" w:sz="0"/>
-            </w:tcBorders>
-            <w:tcMar>
-              <w:top w:type="dxa" w:w="60"/>
-              <w:left w:type="dxa" w:w="80"/>
-              <w:bottom w:type="dxa" w:w="60"/>
-              <w:right w:type="dxa" w:w="80"/>
-            </w:tcMar>
-            <w:vAlign w:val="top"/>
-          </w:tcPr>
-          <w:p>
-            <w:pPr>
-              <w:keepNext w:val="false"/>
-              <w:spacing w:after="0" w:line="240" w:lineRule="auto"/>
-            </w:pPr>
-            <w:r>
-              <w:rPr>
-                <w:b w:val="false"/>
-                <w:bCs w:val="false"/>
-                <w:sz w:val="20"/>
-                <w:szCs w:val="20"/>
-              </w:rPr>
-              <w:t xml:space="preserve">Cinco tareas simples no justifican la complejidad de Airflow</w:t>
+            <w:tcW w:type="dxa" w:w="2995"/>
+            <w:tcBorders>
+              <w:top w:val="none" w:color="FFFFFF" w:sz="0"/>
+              <w:left w:val="none" w:color="FFFFFF" w:sz="0"/>
+              <w:bottom w:val="none" w:color="FFFFFF" w:sz="0"/>
+              <w:right w:val="none" w:color="FFFFFF" w:sz="0"/>
+            </w:tcBorders>
+            <w:tcMar>
+              <w:top w:type="dxa" w:w="60"/>
+              <w:left w:type="dxa" w:w="80"/>
+              <w:bottom w:type="dxa" w:w="60"/>
+              <w:right w:type="dxa" w:w="80"/>
+            </w:tcMar>
+            <w:vAlign w:val="top"/>
+          </w:tcPr>
+          <w:p>
+            <w:pPr>
+              <w:keepNext w:val="false"/>
+              <w:spacing w:after="0" w:line="240" w:lineRule="auto"/>
+            </w:pPr>
+            <w:r>
+              <w:rPr>
+                <w:b w:val="false"/>
+                <w:bCs w:val="false"/>
+                <w:sz w:val="20"/>
+                <w:szCs w:val="20"/>
+              </w:rPr>
+              <w:t xml:space="preserve">Siete tareas simples no justifican la complejidad de Airflow</w:t>
             </w:r>
           </w:p>
         </w:tc>
@@ -6275,7 +6275,7 @@
         </w:tc>
         <w:tc>
           <w:tcPr>
-            <w:tcW w:type="dxa" w:w="2862"/>
+            <w:tcW w:type="dxa" w:w="2993"/>
             <w:tcBorders>
               <w:top w:val="none" w:color="FFFFFF" w:sz="0"/>
               <w:left w:val="none" w:color="FFFFFF" w:sz="0"/>
@@ -6308,7 +6308,7 @@
         </w:tc>
         <w:tc>
           <w:tcPr>
-            <w:tcW w:type="dxa" w:w="2862"/>
+            <w:tcW w:type="dxa" w:w="2747"/>
             <w:tcBorders>
               <w:top w:val="none" w:color="FFFFFF" w:sz="0"/>
               <w:left w:val="none" w:color="FFFFFF" w:sz="0"/>
@@ -6341,7 +6341,7 @@
         </w:tc>
         <w:tc>
           <w:tcPr>
-            <w:tcW w:type="dxa" w:w="3011"/>
+            <w:tcW w:type="dxa" w:w="2995"/>
             <w:tcBorders>
               <w:top w:val="none" w:color="FFFFFF" w:sz="0"/>
               <w:left w:val="none" w:color="FFFFFF" w:sz="0"/>
@@ -6412,100 +6412,100 @@
         </w:tc>
         <w:tc>
           <w:tcPr>
-            <w:tcW w:type="dxa" w:w="2862"/>
-            <w:tcBorders>
-              <w:top w:val="none" w:color="FFFFFF" w:sz="0"/>
-              <w:left w:val="none" w:color="FFFFFF" w:sz="0"/>
-              <w:bottom w:val="none" w:color="FFFFFF" w:sz="0"/>
-              <w:right w:val="none" w:color="FFFFFF" w:sz="0"/>
-            </w:tcBorders>
-            <w:tcMar>
-              <w:top w:type="dxa" w:w="60"/>
-              <w:left w:type="dxa" w:w="80"/>
-              <w:bottom w:type="dxa" w:w="60"/>
-              <w:right w:type="dxa" w:w="80"/>
-            </w:tcMar>
-            <w:vAlign w:val="top"/>
-          </w:tcPr>
-          <w:p>
-            <w:pPr>
-              <w:keepNext w:val="false"/>
-              <w:spacing w:after="0" w:line="240" w:lineRule="auto"/>
-            </w:pPr>
-            <w:r>
-              <w:rPr>
-                <w:b w:val="false"/>
-                <w:bCs w:val="false"/>
-                <w:sz w:val="20"/>
-                <w:szCs w:val="20"/>
-              </w:rPr>
-              <w:t xml:space="preserve">DLQ, reintentos, buffer en disco y pérdida aceptable definida</w:t>
-            </w:r>
-          </w:p>
-        </w:tc>
-        <w:tc>
-          <w:tcPr>
-            <w:tcW w:type="dxa" w:w="2862"/>
-            <w:tcBorders>
-              <w:top w:val="none" w:color="FFFFFF" w:sz="0"/>
-              <w:left w:val="none" w:color="FFFFFF" w:sz="0"/>
-              <w:bottom w:val="none" w:color="FFFFFF" w:sz="0"/>
-              <w:right w:val="none" w:color="FFFFFF" w:sz="0"/>
-            </w:tcBorders>
-            <w:tcMar>
-              <w:top w:type="dxa" w:w="60"/>
-              <w:left w:type="dxa" w:w="80"/>
-              <w:bottom w:type="dxa" w:w="60"/>
-              <w:right w:type="dxa" w:w="80"/>
-            </w:tcMar>
-            <w:vAlign w:val="top"/>
-          </w:tcPr>
-          <w:p>
-            <w:pPr>
-              <w:keepNext w:val="false"/>
-              <w:spacing w:after="0" w:line="240" w:lineRule="auto"/>
-            </w:pPr>
-            <w:r>
-              <w:rPr>
-                <w:b w:val="false"/>
-                <w:bCs w:val="false"/>
-                <w:sz w:val="20"/>
-                <w:szCs w:val="20"/>
-              </w:rPr>
-              <w:t xml:space="preserve">Descartar o reintentar indefinidamente</w:t>
-            </w:r>
-          </w:p>
-        </w:tc>
-        <w:tc>
-          <w:tcPr>
-            <w:tcW w:type="dxa" w:w="3011"/>
-            <w:tcBorders>
-              <w:top w:val="none" w:color="FFFFFF" w:sz="0"/>
-              <w:left w:val="none" w:color="FFFFFF" w:sz="0"/>
-              <w:bottom w:val="none" w:color="FFFFFF" w:sz="0"/>
-              <w:right w:val="none" w:color="FFFFFF" w:sz="0"/>
-            </w:tcBorders>
-            <w:tcMar>
-              <w:top w:type="dxa" w:w="60"/>
-              <w:left w:type="dxa" w:w="80"/>
-              <w:bottom w:type="dxa" w:w="60"/>
-              <w:right w:type="dxa" w:w="80"/>
-            </w:tcMar>
-            <w:vAlign w:val="top"/>
-          </w:tcPr>
-          <w:p>
-            <w:pPr>
-              <w:keepNext w:val="false"/>
-              <w:spacing w:after="0" w:line="240" w:lineRule="auto"/>
-            </w:pPr>
-            <w:r>
-              <w:rPr>
-                <w:b w:val="false"/>
-                <w:bCs w:val="false"/>
-                <w:sz w:val="20"/>
-                <w:szCs w:val="20"/>
-              </w:rPr>
-              <w:t xml:space="preserve">Cero pérdida de eventos críticos</w:t>
+            <w:tcW w:type="dxa" w:w="2993"/>
+            <w:tcBorders>
+              <w:top w:val="none" w:color="FFFFFF" w:sz="0"/>
+              <w:left w:val="none" w:color="FFFFFF" w:sz="0"/>
+              <w:bottom w:val="none" w:color="FFFFFF" w:sz="0"/>
+              <w:right w:val="none" w:color="FFFFFF" w:sz="0"/>
+            </w:tcBorders>
+            <w:tcMar>
+              <w:top w:type="dxa" w:w="60"/>
+              <w:left w:type="dxa" w:w="80"/>
+              <w:bottom w:type="dxa" w:w="60"/>
+              <w:right w:type="dxa" w:w="80"/>
+            </w:tcMar>
+            <w:vAlign w:val="top"/>
+          </w:tcPr>
+          <w:p>
+            <w:pPr>
+              <w:keepNext w:val="false"/>
+              <w:spacing w:after="0" w:line="240" w:lineRule="auto"/>
+            </w:pPr>
+            <w:r>
+              <w:rPr>
+                <w:b w:val="false"/>
+                <w:bCs w:val="false"/>
+                <w:sz w:val="20"/>
+                <w:szCs w:val="20"/>
+              </w:rPr>
+              <w:t xml:space="preserve">DLQ con reproceso, reintentos según la clase de falla, escritura anticipada en disco y vigilante del nodo B</w:t>
+            </w:r>
+          </w:p>
+        </w:tc>
+        <w:tc>
+          <w:tcPr>
+            <w:tcW w:type="dxa" w:w="2747"/>
+            <w:tcBorders>
+              <w:top w:val="none" w:color="FFFFFF" w:sz="0"/>
+              <w:left w:val="none" w:color="FFFFFF" w:sz="0"/>
+              <w:bottom w:val="none" w:color="FFFFFF" w:sz="0"/>
+              <w:right w:val="none" w:color="FFFFFF" w:sz="0"/>
+            </w:tcBorders>
+            <w:tcMar>
+              <w:top w:type="dxa" w:w="60"/>
+              <w:left w:type="dxa" w:w="80"/>
+              <w:bottom w:type="dxa" w:w="60"/>
+              <w:right w:type="dxa" w:w="80"/>
+            </w:tcMar>
+            <w:vAlign w:val="top"/>
+          </w:tcPr>
+          <w:p>
+            <w:pPr>
+              <w:keepNext w:val="false"/>
+              <w:spacing w:after="0" w:line="240" w:lineRule="auto"/>
+            </w:pPr>
+            <w:r>
+              <w:rPr>
+                <w:b w:val="false"/>
+                <w:bCs w:val="false"/>
+                <w:sz w:val="20"/>
+                <w:szCs w:val="20"/>
+              </w:rPr>
+              <w:t xml:space="preserve">Número fijo de reintentos, buffer solo tras fallar el envío</w:t>
+            </w:r>
+          </w:p>
+        </w:tc>
+        <w:tc>
+          <w:tcPr>
+            <w:tcW w:type="dxa" w:w="2995"/>
+            <w:tcBorders>
+              <w:top w:val="none" w:color="FFFFFF" w:sz="0"/>
+              <w:left w:val="none" w:color="FFFFFF" w:sz="0"/>
+              <w:bottom w:val="none" w:color="FFFFFF" w:sz="0"/>
+              <w:right w:val="none" w:color="FFFFFF" w:sz="0"/>
+            </w:tcBorders>
+            <w:tcMar>
+              <w:top w:type="dxa" w:w="60"/>
+              <w:left w:type="dxa" w:w="80"/>
+              <w:bottom w:type="dxa" w:w="60"/>
+              <w:right w:type="dxa" w:w="80"/>
+            </w:tcMar>
+            <w:vAlign w:val="top"/>
+          </w:tcPr>
+          <w:p>
+            <w:pPr>
+              <w:keepNext w:val="false"/>
+              <w:spacing w:after="0" w:line="240" w:lineRule="auto"/>
+            </w:pPr>
+            <w:r>
+              <w:rPr>
+                <w:b w:val="false"/>
+                <w:bCs w:val="false"/>
+                <w:sz w:val="20"/>
+                <w:szCs w:val="20"/>
+              </w:rPr>
+              <w:t xml:space="preserve">Cero pérdida de eventos críticos y caídas visibles</w:t>
             </w:r>
           </w:p>
         </w:tc>
@@ -6549,7 +6549,7 @@
         </w:tc>
         <w:tc>
           <w:tcPr>
-            <w:tcW w:type="dxa" w:w="2862"/>
+            <w:tcW w:type="dxa" w:w="2993"/>
             <w:tcBorders>
               <w:top w:val="none" w:color="FFFFFF" w:sz="0"/>
               <w:left w:val="none" w:color="FFFFFF" w:sz="0"/>
@@ -6582,7 +6582,7 @@
         </w:tc>
         <w:tc>
           <w:tcPr>
-            <w:tcW w:type="dxa" w:w="2862"/>
+            <w:tcW w:type="dxa" w:w="2747"/>
             <w:tcBorders>
               <w:top w:val="none" w:color="FFFFFF" w:sz="0"/>
               <w:left w:val="none" w:color="FFFFFF" w:sz="0"/>
@@ -6615,7 +6615,7 @@
         </w:tc>
         <w:tc>
           <w:tcPr>
-            <w:tcW w:type="dxa" w:w="3011"/>
+            <w:tcW w:type="dxa" w:w="2995"/>
             <w:tcBorders>
               <w:top w:val="none" w:color="FFFFFF" w:sz="0"/>
               <w:left w:val="none" w:color="FFFFFF" w:sz="0"/>
@@ -6686,7 +6686,7 @@
         </w:tc>
         <w:tc>
           <w:tcPr>
-            <w:tcW w:type="dxa" w:w="2862"/>
+            <w:tcW w:type="dxa" w:w="2993"/>
             <w:tcBorders>
               <w:top w:val="none" w:color="FFFFFF" w:sz="0"/>
               <w:left w:val="none" w:color="FFFFFF" w:sz="0"/>
@@ -6719,7 +6719,7 @@
         </w:tc>
         <w:tc>
           <w:tcPr>
-            <w:tcW w:type="dxa" w:w="2862"/>
+            <w:tcW w:type="dxa" w:w="2747"/>
             <w:tcBorders>
               <w:top w:val="none" w:color="FFFFFF" w:sz="0"/>
               <w:left w:val="none" w:color="FFFFFF" w:sz="0"/>
@@ -6752,7 +6752,7 @@
         </w:tc>
         <w:tc>
           <w:tcPr>
-            <w:tcW w:type="dxa" w:w="3011"/>
+            <w:tcW w:type="dxa" w:w="2995"/>
             <w:tcBorders>
               <w:top w:val="none" w:color="FFFFFF" w:sz="0"/>
               <w:left w:val="none" w:color="FFFFFF" w:sz="0"/>
@@ -6823,7 +6823,7 @@
         </w:tc>
         <w:tc>
           <w:tcPr>
-            <w:tcW w:type="dxa" w:w="2862"/>
+            <w:tcW w:type="dxa" w:w="2993"/>
             <w:tcBorders>
               <w:top w:val="none" w:color="FFFFFF" w:sz="0"/>
               <w:left w:val="none" w:color="FFFFFF" w:sz="0"/>
@@ -6856,7 +6856,7 @@
         </w:tc>
         <w:tc>
           <w:tcPr>
-            <w:tcW w:type="dxa" w:w="2862"/>
+            <w:tcW w:type="dxa" w:w="2747"/>
             <w:tcBorders>
               <w:top w:val="none" w:color="FFFFFF" w:sz="0"/>
               <w:left w:val="none" w:color="FFFFFF" w:sz="0"/>
@@ -6889,7 +6889,7 @@
         </w:tc>
         <w:tc>
           <w:tcPr>
-            <w:tcW w:type="dxa" w:w="3011"/>
+            <w:tcW w:type="dxa" w:w="2995"/>
             <w:tcBorders>
               <w:top w:val="none" w:color="FFFFFF" w:sz="0"/>
               <w:left w:val="none" w:color="FFFFFF" w:sz="0"/>
@@ -6960,7 +6960,7 @@
         </w:tc>
         <w:tc>
           <w:tcPr>
-            <w:tcW w:type="dxa" w:w="2862"/>
+            <w:tcW w:type="dxa" w:w="2993"/>
             <w:tcBorders>
               <w:top w:val="none" w:color="FFFFFF" w:sz="0"/>
               <w:left w:val="none" w:color="FFFFFF" w:sz="0"/>
@@ -6993,7 +6993,7 @@
         </w:tc>
         <w:tc>
           <w:tcPr>
-            <w:tcW w:type="dxa" w:w="2862"/>
+            <w:tcW w:type="dxa" w:w="2747"/>
             <w:tcBorders>
               <w:top w:val="none" w:color="FFFFFF" w:sz="0"/>
               <w:left w:val="none" w:color="FFFFFF" w:sz="0"/>
@@ -7026,7 +7026,7 @@
         </w:tc>
         <w:tc>
           <w:tcPr>
-            <w:tcW w:type="dxa" w:w="3011"/>
+            <w:tcW w:type="dxa" w:w="2995"/>
             <w:tcBorders>
               <w:top w:val="none" w:color="FFFFFF" w:sz="0"/>
               <w:left w:val="none" w:color="FFFFFF" w:sz="0"/>
@@ -7895,7 +7895,7 @@
         <w:jc w:val="both"/>
       </w:pPr>
       <w:r>
-        <w:t xml:space="preserve">El enunciado pregunta si se justifica la complejidad operativa de Airflow. Las tareas del sistema son cinco, cortas e independientes: monitor de SLO, retención de placas, expiración de alertas, calidad de reglas y sincronización de la lista de placas robadas. Airflow agregaría entre cuatro y cinco contenedores, de 2 a 4 GB de memoria y la obligación de escribir los flujos en Python, en contra del requisito de programar en Java. Se optó por Spring Scheduler con ShedLock, que garantiza que cada tarea se ejecute en una sola instancia aunque existan varias. De forma análoga, se decidió conscientemente no usar Kubernetes: con tres o cuatro máquinas su plano de control consumiría una parte significativa de los recursos y su red superpuesta añadiría puntos de falla el día de la demostración, mientras que el escalamiento que el sistema necesita ya lo resuelven los grupos de consumidores de Kafka.</w:t>
+        <w:t xml:space="preserve">El enunciado pregunta si se justifica la complejidad operativa de Airflow. Las tareas del sistema son siete, cortas e independientes: monitor de SLO, retención de placas, expiración de alertas, calidad de reglas, sincronización de la lista de placas robadas, su revisión cada 15 segundos y el reproceso de la cola de mensajes muertos. Airflow agregaría entre cuatro y cinco contenedores, de 2 a 4 GB de memoria y la obligación de escribir los flujos en Python, en contra del requisito de programar en Java. Se optó por Spring Scheduler con ShedLock, que garantiza que cada tarea se ejecute en una sola instancia aunque existan varias. De forma análoga, se decidió conscientemente no usar Kubernetes: con tres o cuatro máquinas su plano de control consumiría una parte significativa de los recursos y su red superpuesta añadiría puntos de falla el día de la demostración, mientras que el escalamiento que el sistema necesita ya lo resuelven los grupos de consumidores de Kafka.</w:t>
       </w:r>
     </w:p>
     <w:p>
@@ -7914,7 +7914,7 @@
         <w:jc w:val="both"/>
       </w:pPr>
       <w:r>
-        <w:t xml:space="preserve">La política de resiliencia parte de reconocer que no todos los eventos valen lo mismo. Los botones de pánico y los reportes ciudadanos tienen pérdida aceptable cero y se guardan en un buffer en disco si Kafka no está disponible; la telemetría de alto volumen puede perderse durante una caída del broker. Los mensajes inválidos van a una cola de mensajes muertos sin reintentos, los errores transitorios se reintentan con espera exponencial y la entrega es de al menos una vez, con deduplicación por identificador de evento.</w:t>
+        <w:t xml:space="preserve">La política de resiliencia parte de reconocer que no todos los eventos valen lo mismo. Los botones de pánico, los reportes ciudadanos y los disparos tienen pérdida aceptable cero: se escriben en un diario en disco antes de enviarse (escritura anticipada) y se reenvían cuando Kafka vuelve, tanto en los nodos generadores como en la pasarela de la aplicación móvil. La telemetría que puede corroborar un incidente (placas, excesos de velocidad y sonidos relevantes) se conserva en disco durante 15 minutos como máximo, mientras que las lecturas normales pueden perderse durante una caída del broker. Cada falla se clasifica: los mensajes inválidos van a una cola de mensajes muertos sin reintentos, los errores transitorios (Redis, la base o Kafka no disponibles) se reintentan sin límite con espera exponencial y una tarea periódica reprocesa la cola de mensajes muertos. La entrega es de al menos una vez, con deduplicación por identificador de evento e identificadores deterministas para las alertas, de modo que una alerta reprocesada no se duplica.</w:t>
       </w:r>
     </w:p>
     <w:p>
@@ -7924,7 +7924,7 @@
         <w:jc w:val="both"/>
       </w:pPr>
       <w:r>
-        <w:t xml:space="preserve">En seguridad, la placa se reemplaza en la puerta de entrada por un seudónimo HMAC-SHA256 con llave secreta. Se descartó el hash simple porque las placas guatemaltecas tienen pocas combinaciones y podrían revertirse por fuerza bruta. El seudónimo permite seguir vehículos y compararlos con la lista de robados sin conocer la placa, se borra a los 30 días y nunca es visible para Grafana. Las ubicaciones de ciudadanos se generalizan a unos 110 metros y todas las acciones humanas quedan en una bitácora de auditoría.</w:t>
+        <w:t xml:space="preserve">La arquitectura separa el estado (nodo A) del cómputo (nodo B). Si cae el nodo B, Kafka retiene los eventos y las instancias de los nodos C y D siguen detectando; un vigilante que corre en el nodo C anuncia la caída en segundos y la consola del operador muestra un aviso de desconexión y, al reconectar, destaca las alertas que no se vieron a tiempo. Si cae el nodo A, ningún evento crítico se pierde y, al volver, la lista de placas robadas se reconstruye sola desde la base.</w:t>
       </w:r>
     </w:p>
     <w:p>
@@ -7934,25 +7934,7 @@
         <w:jc w:val="both"/>
       </w:pPr>
       <w:r>
-        <w:t xml:space="preserve">En observabilidad se definieron cuatro SLO: latencia de alerta (95 % por debajo de 2 segundos), pérdida de eventos críticos (cero), frescura de datos (por debajo de 10 segundos) y rezago de procesamiento. Cuando el SLO de latencia o de frescura se incumple, el sistema activa automáticamente una degradación controlada: conserva solo una muestra de las lecturas de velocidad normales, el mayor volumen y que no participa en la correlación, y publica una alerta de sistema en la consola del operador.</w:t>
-      </w:r>
-    </w:p>
-    <w:p>
-      <w:pPr>
-        <w:pStyle w:val="Heading1"/>
-        <w:keepNext/>
-      </w:pPr>
-      <w:r>
-        <w:t xml:space="preserve">7. Evaluación de resultados</w:t>
-      </w:r>
-    </w:p>
-    <w:p>
-      <w:pPr>
-        <w:pStyle w:val="Heading2"/>
-        <w:keepNext/>
-      </w:pPr>
-      <w:r>
-        <w:t xml:space="preserve">7.1 Metodología</w:t>
+        <w:t xml:space="preserve">En seguridad, la placa se reemplaza en la puerta de entrada por un seudónimo HMAC-SHA256 con llave secreta. Se descartó el hash simple porque las placas guatemaltecas tienen pocas combinaciones y podrían revertirse por fuerza bruta. El seudónimo permite seguir vehículos y compararlos con la lista de robados sin conocer la placa, se borra a los 30 días y nunca es visible para Grafana. Las ubicaciones de ciudadanos se generalizan a unos 110 metros y todas las acciones humanas quedan en una bitácora de auditoría.</w:t>
       </w:r>
     </w:p>
     <w:p>
@@ -7962,7 +7944,35 @@
         <w:jc w:val="both"/>
       </w:pPr>
       <w:r>
-        <w:t xml:space="preserve">Las pruebas se ejecutaron en un equipo de cuatro núcleos y 16 GB de memoria, primero con todos los servicios en una sola composición y después en modo multi-nodo, con los nodos A, B y C levantados como proyectos independientes conectados por dirección IP. Como todos los servicios compartían los mismos núcleos, los resultados representan un límite inferior respecto al hardware dedicado propuesto. Se evaluaron cuatro aspectos: la validación de correlaciones esperadas, el comportamiento ante picos de carga, la resiliencia ante fallas y la distribución de carga entre máquinas. Además, el proyecto incluye 26 pruebas unitarias automatizadas, 15 de ellas sobre el modelo de correlación usando las mismas reglas de configuración.</w:t>
+        <w:t xml:space="preserve">En observabilidad se definieron cuatro SLO: latencia de alerta (95 % por debajo de 2 segundos), pérdida de eventos críticos (cero), frescura de datos (por debajo de 10 segundos) y rezago de procesamiento. Cuando el SLO de latencia o de frescura se incumple, el sistema determina primero la causa a partir del rezago de los consumidores de Kafka. Si el rezago es grande y sostenido, se trata de una sobrecarga y el sistema activa automáticamente una degradación controlada: conserva solo una muestra de las lecturas de velocidad normales, el mayor volumen y que no participa en la correlación, y publica una alerta de sistema en la consola del operador. Si el rezago es bajo o va bajando, las alertas tardías corresponden a la puesta al día tras una caída ya superada: se informa al operador, pero no se degrada, porque se descartarían datos justo durante la recuperación.</w:t>
+      </w:r>
+    </w:p>
+    <w:p>
+      <w:pPr>
+        <w:pStyle w:val="Heading1"/>
+        <w:keepNext/>
+      </w:pPr>
+      <w:r>
+        <w:t xml:space="preserve">7. Evaluación de resultados</w:t>
+      </w:r>
+    </w:p>
+    <w:p>
+      <w:pPr>
+        <w:pStyle w:val="Heading2"/>
+        <w:keepNext/>
+      </w:pPr>
+      <w:r>
+        <w:t xml:space="preserve">7.1 Metodología</w:t>
+      </w:r>
+    </w:p>
+    <w:p>
+      <w:pPr>
+        <w:spacing w:after="0" w:line="360" w:lineRule="auto"/>
+        <w:ind w:firstLine="720"/>
+        <w:jc w:val="both"/>
+      </w:pPr>
+      <w:r>
+        <w:t xml:space="preserve">Las pruebas se ejecutaron en un equipo de cuatro núcleos y 16 GB de memoria, primero con todos los servicios en una sola composición y después en modo multi-nodo, con los nodos A, B y C levantados como proyectos independientes conectados por dirección IP. Como todos los servicios compartían los mismos núcleos, los resultados representan un límite inferior respecto al hardware dedicado propuesto. Se evaluaron cuatro aspectos: la validación de correlaciones esperadas, el comportamiento ante picos de carga, la resiliencia ante fallas y la distribución de carga entre máquinas. Para la resiliencia se apagó de verdad cada servidor con escenarios en curso y la consola del operador abierta en un navegador automatizado. Además, el proyecto incluye 90 pruebas unitarias automatizadas: 20 sobre el modelo de correlación con las mismas reglas de configuración y el resto sobre el diario en disco, la clasificación de fallas, la deduplicación, la pasarela de la aplicación, el vigilante y el monitor de SLO.</w:t>
       </w:r>
     </w:p>
     <w:p>
@@ -11445,9 +11455,9 @@
         </w:tblBorders>
       </w:tblPr>
       <w:tblGrid>
-        <w:gridCol w:w="1746"/>
-        <w:gridCol w:w="3965"/>
-        <w:gridCol w:w="3649"/>
+        <w:gridCol w:w="2204"/>
+        <w:gridCol w:w="3702"/>
+        <w:gridCol w:w="3454"/>
       </w:tblGrid>
       <w:tr>
         <w:trPr>
@@ -11455,7 +11465,7 @@
         </w:trPr>
         <w:tc>
           <w:tcPr>
-            <w:tcW w:type="dxa" w:w="1746"/>
+            <w:tcW w:type="dxa" w:w="2204"/>
             <w:tcBorders>
               <w:top w:val="single" w:color="000000" w:sz="8"/>
               <w:left w:val="none" w:color="FFFFFF" w:sz="0"/>
@@ -11488,7 +11498,7 @@
         </w:tc>
         <w:tc>
           <w:tcPr>
-            <w:tcW w:type="dxa" w:w="3965"/>
+            <w:tcW w:type="dxa" w:w="3702"/>
             <w:tcBorders>
               <w:top w:val="single" w:color="000000" w:sz="8"/>
               <w:left w:val="none" w:color="FFFFFF" w:sz="0"/>
@@ -11521,7 +11531,7 @@
         </w:tc>
         <w:tc>
           <w:tcPr>
-            <w:tcW w:type="dxa" w:w="3649"/>
+            <w:tcW w:type="dxa" w:w="3454"/>
             <w:tcBorders>
               <w:top w:val="single" w:color="000000" w:sz="8"/>
               <w:left w:val="none" w:color="FFFFFF" w:sz="0"/>
@@ -11559,100 +11569,100 @@
         </w:trPr>
         <w:tc>
           <w:tcPr>
-            <w:tcW w:type="dxa" w:w="1746"/>
-            <w:tcBorders>
-              <w:top w:val="none" w:color="FFFFFF" w:sz="0"/>
-              <w:left w:val="none" w:color="FFFFFF" w:sz="0"/>
-              <w:bottom w:val="none" w:color="FFFFFF" w:sz="0"/>
-              <w:right w:val="none" w:color="FFFFFF" w:sz="0"/>
-            </w:tcBorders>
-            <w:tcMar>
-              <w:top w:type="dxa" w:w="60"/>
-              <w:left w:type="dxa" w:w="80"/>
-              <w:bottom w:type="dxa" w:w="60"/>
-              <w:right w:type="dxa" w:w="80"/>
-            </w:tcMar>
-            <w:vAlign w:val="top"/>
-          </w:tcPr>
-          <w:p>
-            <w:pPr>
-              <w:keepNext w:val="false"/>
-              <w:spacing w:after="0" w:line="240" w:lineRule="auto"/>
-            </w:pPr>
-            <w:r>
-              <w:rPr>
-                <w:b w:val="false"/>
-                <w:bCs w:val="false"/>
-                <w:sz w:val="20"/>
-                <w:szCs w:val="20"/>
-              </w:rPr>
-              <w:t xml:space="preserve">Mensajes inválidos</w:t>
-            </w:r>
-          </w:p>
-        </w:tc>
-        <w:tc>
-          <w:tcPr>
-            <w:tcW w:type="dxa" w:w="3965"/>
-            <w:tcBorders>
-              <w:top w:val="none" w:color="FFFFFF" w:sz="0"/>
-              <w:left w:val="none" w:color="FFFFFF" w:sz="0"/>
-              <w:bottom w:val="none" w:color="FFFFFF" w:sz="0"/>
-              <w:right w:val="none" w:color="FFFFFF" w:sz="0"/>
-            </w:tcBorders>
-            <w:tcMar>
-              <w:top w:type="dxa" w:w="60"/>
-              <w:left w:type="dxa" w:w="80"/>
-              <w:bottom w:type="dxa" w:w="60"/>
-              <w:right w:type="dxa" w:w="80"/>
-            </w:tcMar>
-            <w:vAlign w:val="top"/>
-          </w:tcPr>
-          <w:p>
-            <w:pPr>
-              <w:keepNext w:val="false"/>
-              <w:spacing w:after="0" w:line="240" w:lineRule="auto"/>
-            </w:pPr>
-            <w:r>
-              <w:rPr>
-                <w:b w:val="false"/>
-                <w:bCs w:val="false"/>
-                <w:sz w:val="20"/>
-                <w:szCs w:val="20"/>
-              </w:rPr>
-              <w:t xml:space="preserve">Inyección de tres mensajes con la herramienta de línea de comandos de Kafka</w:t>
-            </w:r>
-          </w:p>
-        </w:tc>
-        <w:tc>
-          <w:tcPr>
-            <w:tcW w:type="dxa" w:w="3649"/>
-            <w:tcBorders>
-              <w:top w:val="none" w:color="FFFFFF" w:sz="0"/>
-              <w:left w:val="none" w:color="FFFFFF" w:sz="0"/>
-              <w:bottom w:val="none" w:color="FFFFFF" w:sz="0"/>
-              <w:right w:val="none" w:color="FFFFFF" w:sz="0"/>
-            </w:tcBorders>
-            <w:tcMar>
-              <w:top w:type="dxa" w:w="60"/>
-              <w:left w:type="dxa" w:w="80"/>
-              <w:bottom w:type="dxa" w:w="60"/>
-              <w:right w:type="dxa" w:w="80"/>
-            </w:tcMar>
-            <w:vAlign w:val="top"/>
-          </w:tcPr>
-          <w:p>
-            <w:pPr>
-              <w:keepNext w:val="false"/>
-              <w:spacing w:after="0" w:line="240" w:lineRule="auto"/>
-            </w:pPr>
-            <w:r>
-              <w:rPr>
-                <w:b w:val="false"/>
-                <w:bCs w:val="false"/>
-                <w:sz w:val="20"/>
-                <w:szCs w:val="20"/>
-              </w:rPr>
-              <w:t xml:space="preserve">Los tres llegaron a la cola de mensajes muertos con su causa, sin afectar el resto del flujo</w:t>
+            <w:tcW w:type="dxa" w:w="2204"/>
+            <w:tcBorders>
+              <w:top w:val="none" w:color="FFFFFF" w:sz="0"/>
+              <w:left w:val="none" w:color="FFFFFF" w:sz="0"/>
+              <w:bottom w:val="none" w:color="FFFFFF" w:sz="0"/>
+              <w:right w:val="none" w:color="FFFFFF" w:sz="0"/>
+            </w:tcBorders>
+            <w:tcMar>
+              <w:top w:type="dxa" w:w="60"/>
+              <w:left w:type="dxa" w:w="80"/>
+              <w:bottom w:type="dxa" w:w="60"/>
+              <w:right w:type="dxa" w:w="80"/>
+            </w:tcMar>
+            <w:vAlign w:val="top"/>
+          </w:tcPr>
+          <w:p>
+            <w:pPr>
+              <w:keepNext w:val="false"/>
+              <w:spacing w:after="0" w:line="240" w:lineRule="auto"/>
+            </w:pPr>
+            <w:r>
+              <w:rPr>
+                <w:b w:val="false"/>
+                <w:bCs w:val="false"/>
+                <w:sz w:val="20"/>
+                <w:szCs w:val="20"/>
+              </w:rPr>
+              <w:t xml:space="preserve">Caída del nodo B (93 s)</w:t>
+            </w:r>
+          </w:p>
+        </w:tc>
+        <w:tc>
+          <w:tcPr>
+            <w:tcW w:type="dxa" w:w="3702"/>
+            <w:tcBorders>
+              <w:top w:val="none" w:color="FFFFFF" w:sz="0"/>
+              <w:left w:val="none" w:color="FFFFFF" w:sz="0"/>
+              <w:bottom w:val="none" w:color="FFFFFF" w:sz="0"/>
+              <w:right w:val="none" w:color="FFFFFF" w:sz="0"/>
+            </w:tcBorders>
+            <w:tcMar>
+              <w:top w:type="dxa" w:w="60"/>
+              <w:left w:type="dxa" w:w="80"/>
+              <w:bottom w:type="dxa" w:w="60"/>
+              <w:right w:type="dxa" w:w="80"/>
+            </w:tcMar>
+            <w:vAlign w:val="top"/>
+          </w:tcPr>
+          <w:p>
+            <w:pPr>
+              <w:keepNext w:val="false"/>
+              <w:spacing w:after="0" w:line="240" w:lineRule="auto"/>
+            </w:pPr>
+            <w:r>
+              <w:rPr>
+                <w:b w:val="false"/>
+                <w:bCs w:val="false"/>
+                <w:sz w:val="20"/>
+                <w:szCs w:val="20"/>
+              </w:rPr>
+              <w:t xml:space="preserve">Se apagó el servidor de servicios y se lanzó el escenario de disparos</w:t>
+            </w:r>
+          </w:p>
+        </w:tc>
+        <w:tc>
+          <w:tcPr>
+            <w:tcW w:type="dxa" w:w="3454"/>
+            <w:tcBorders>
+              <w:top w:val="none" w:color="FFFFFF" w:sz="0"/>
+              <w:left w:val="none" w:color="FFFFFF" w:sz="0"/>
+              <w:bottom w:val="none" w:color="FFFFFF" w:sz="0"/>
+              <w:right w:val="none" w:color="FFFFFF" w:sz="0"/>
+            </w:tcBorders>
+            <w:tcMar>
+              <w:top w:type="dxa" w:w="60"/>
+              <w:left w:type="dxa" w:w="80"/>
+              <w:bottom w:type="dxa" w:w="60"/>
+              <w:right w:type="dxa" w:w="80"/>
+            </w:tcMar>
+            <w:vAlign w:val="top"/>
+          </w:tcPr>
+          <w:p>
+            <w:pPr>
+              <w:keepNext w:val="false"/>
+              <w:spacing w:after="0" w:line="240" w:lineRule="auto"/>
+            </w:pPr>
+            <w:r>
+              <w:rPr>
+                <w:b w:val="false"/>
+                <w:bCs w:val="false"/>
+                <w:sz w:val="20"/>
+                <w:szCs w:val="20"/>
+              </w:rPr>
+              <w:t xml:space="preserve">El vigilante del nodo C anunció la caída a los 16 s; la instancia del nodo C generó la alerta de disparos 10 s después del escenario; la consola avisó la desconexión y al reconectar destacó la alerta que llegó 91 s tarde; sin pérdidas y sin activar la degradación</w:t>
             </w:r>
           </w:p>
         </w:tc>
@@ -11663,100 +11673,100 @@
         </w:trPr>
         <w:tc>
           <w:tcPr>
-            <w:tcW w:type="dxa" w:w="1746"/>
-            <w:tcBorders>
-              <w:top w:val="none" w:color="FFFFFF" w:sz="0"/>
-              <w:left w:val="none" w:color="FFFFFF" w:sz="0"/>
-              <w:bottom w:val="none" w:color="FFFFFF" w:sz="0"/>
-              <w:right w:val="none" w:color="FFFFFF" w:sz="0"/>
-            </w:tcBorders>
-            <w:tcMar>
-              <w:top w:type="dxa" w:w="60"/>
-              <w:left w:type="dxa" w:w="80"/>
-              <w:bottom w:type="dxa" w:w="60"/>
-              <w:right w:type="dxa" w:w="80"/>
-            </w:tcMar>
-            <w:vAlign w:val="top"/>
-          </w:tcPr>
-          <w:p>
-            <w:pPr>
-              <w:keepNext w:val="false"/>
-              <w:spacing w:after="0" w:line="240" w:lineRule="auto"/>
-            </w:pPr>
-            <w:r>
-              <w:rPr>
-                <w:b w:val="false"/>
-                <w:bCs w:val="false"/>
-                <w:sz w:val="20"/>
-                <w:szCs w:val="20"/>
-              </w:rPr>
-              <w:t xml:space="preserve">Caída de Kafka</w:t>
-            </w:r>
-          </w:p>
-        </w:tc>
-        <w:tc>
-          <w:tcPr>
-            <w:tcW w:type="dxa" w:w="3965"/>
-            <w:tcBorders>
-              <w:top w:val="none" w:color="FFFFFF" w:sz="0"/>
-              <w:left w:val="none" w:color="FFFFFF" w:sz="0"/>
-              <w:bottom w:val="none" w:color="FFFFFF" w:sz="0"/>
-              <w:right w:val="none" w:color="FFFFFF" w:sz="0"/>
-            </w:tcBorders>
-            <w:tcMar>
-              <w:top w:type="dxa" w:w="60"/>
-              <w:left w:type="dxa" w:w="80"/>
-              <w:bottom w:type="dxa" w:w="60"/>
-              <w:right w:type="dxa" w:w="80"/>
-            </w:tcMar>
-            <w:vAlign w:val="top"/>
-          </w:tcPr>
-          <w:p>
-            <w:pPr>
-              <w:keepNext w:val="false"/>
-              <w:spacing w:after="0" w:line="240" w:lineRule="auto"/>
-            </w:pPr>
-            <w:r>
-              <w:rPr>
-                <w:b w:val="false"/>
-                <w:bCs w:val="false"/>
-                <w:sz w:val="20"/>
-                <w:szCs w:val="20"/>
-              </w:rPr>
-              <w:t xml:space="preserve">Se detuvo el broker y se presionó un botón de emergencia médica</w:t>
-            </w:r>
-          </w:p>
-        </w:tc>
-        <w:tc>
-          <w:tcPr>
-            <w:tcW w:type="dxa" w:w="3649"/>
-            <w:tcBorders>
-              <w:top w:val="none" w:color="FFFFFF" w:sz="0"/>
-              <w:left w:val="none" w:color="FFFFFF" w:sz="0"/>
-              <w:bottom w:val="none" w:color="FFFFFF" w:sz="0"/>
-              <w:right w:val="none" w:color="FFFFFF" w:sz="0"/>
-            </w:tcBorders>
-            <w:tcMar>
-              <w:top w:type="dxa" w:w="60"/>
-              <w:left w:type="dxa" w:w="80"/>
-              <w:bottom w:type="dxa" w:w="60"/>
-              <w:right w:type="dxa" w:w="80"/>
-            </w:tcMar>
-            <w:vAlign w:val="top"/>
-          </w:tcPr>
-          <w:p>
-            <w:pPr>
-              <w:keepNext w:val="false"/>
-              <w:spacing w:after="0" w:line="240" w:lineRule="auto"/>
-            </w:pPr>
-            <w:r>
-              <w:rPr>
-                <w:b w:val="false"/>
-                <w:bCs w:val="false"/>
-                <w:sz w:val="20"/>
-                <w:szCs w:val="20"/>
-              </w:rPr>
-              <w:t xml:space="preserve">El evento quedó en el buffer en disco, se reenvió 7 s después de reiniciar Kafka y generó la alerta; cero eventos críticos perdidos</w:t>
+            <w:tcW w:type="dxa" w:w="2204"/>
+            <w:tcBorders>
+              <w:top w:val="none" w:color="FFFFFF" w:sz="0"/>
+              <w:left w:val="none" w:color="FFFFFF" w:sz="0"/>
+              <w:bottom w:val="none" w:color="FFFFFF" w:sz="0"/>
+              <w:right w:val="none" w:color="FFFFFF" w:sz="0"/>
+            </w:tcBorders>
+            <w:tcMar>
+              <w:top w:type="dxa" w:w="60"/>
+              <w:left w:type="dxa" w:w="80"/>
+              <w:bottom w:type="dxa" w:w="60"/>
+              <w:right w:type="dxa" w:w="80"/>
+            </w:tcMar>
+            <w:vAlign w:val="top"/>
+          </w:tcPr>
+          <w:p>
+            <w:pPr>
+              <w:keepNext w:val="false"/>
+              <w:spacing w:after="0" w:line="240" w:lineRule="auto"/>
+            </w:pPr>
+            <w:r>
+              <w:rPr>
+                <w:b w:val="false"/>
+                <w:bCs w:val="false"/>
+                <w:sz w:val="20"/>
+                <w:szCs w:val="20"/>
+              </w:rPr>
+              <w:t xml:space="preserve">Caída del nodo A (82 s)</w:t>
+            </w:r>
+          </w:p>
+        </w:tc>
+        <w:tc>
+          <w:tcPr>
+            <w:tcW w:type="dxa" w:w="3702"/>
+            <w:tcBorders>
+              <w:top w:val="none" w:color="FFFFFF" w:sz="0"/>
+              <w:left w:val="none" w:color="FFFFFF" w:sz="0"/>
+              <w:bottom w:val="none" w:color="FFFFFF" w:sz="0"/>
+              <w:right w:val="none" w:color="FFFFFF" w:sz="0"/>
+            </w:tcBorders>
+            <w:tcMar>
+              <w:top w:type="dxa" w:w="60"/>
+              <w:left w:type="dxa" w:w="80"/>
+              <w:bottom w:type="dxa" w:w="60"/>
+              <w:right w:type="dxa" w:w="80"/>
+            </w:tcMar>
+            <w:vAlign w:val="top"/>
+          </w:tcPr>
+          <w:p>
+            <w:pPr>
+              <w:keepNext w:val="false"/>
+              <w:spacing w:after="0" w:line="240" w:lineRule="auto"/>
+            </w:pPr>
+            <w:r>
+              <w:rPr>
+                <w:b w:val="false"/>
+                <w:bCs w:val="false"/>
+                <w:sz w:val="20"/>
+                <w:szCs w:val="20"/>
+              </w:rPr>
+              <w:t xml:space="preserve">Se apagaron Kafka, la base y Redis durante un robo en curso y un pánico enviado por la aplicación</w:t>
+            </w:r>
+          </w:p>
+        </w:tc>
+        <w:tc>
+          <w:tcPr>
+            <w:tcW w:type="dxa" w:w="3454"/>
+            <w:tcBorders>
+              <w:top w:val="none" w:color="FFFFFF" w:sz="0"/>
+              <w:left w:val="none" w:color="FFFFFF" w:sz="0"/>
+              <w:bottom w:val="none" w:color="FFFFFF" w:sz="0"/>
+              <w:right w:val="none" w:color="FFFFFF" w:sz="0"/>
+            </w:tcBorders>
+            <w:tcMar>
+              <w:top w:type="dxa" w:w="60"/>
+              <w:left w:type="dxa" w:w="80"/>
+              <w:bottom w:type="dxa" w:w="60"/>
+              <w:right w:type="dxa" w:w="80"/>
+            </w:tcMar>
+            <w:vAlign w:val="top"/>
+          </w:tcPr>
+          <w:p>
+            <w:pPr>
+              <w:keepNext w:val="false"/>
+              <w:spacing w:after="0" w:line="240" w:lineRule="auto"/>
+            </w:pPr>
+            <w:r>
+              <w:rPr>
+                <w:b w:val="false"/>
+                <w:bCs w:val="false"/>
+                <w:sz w:val="20"/>
+                <w:szCs w:val="20"/>
+              </w:rPr>
+              <w:t xml:space="preserve">La pasarela respondió «en cola»; el simulador guardó 4 eventos críticos y 222 de telemetría útil; al volver, el robo se clasificó como robo en curso crítico, el pánico generó su alerta y la lista de placas robadas se recargó sola en 20 s; cero eventos críticos perdidos</w:t>
             </w:r>
           </w:p>
         </w:tc>
@@ -11767,7 +11777,319 @@
         </w:trPr>
         <w:tc>
           <w:tcPr>
-            <w:tcW w:type="dxa" w:w="1746"/>
+            <w:tcW w:type="dxa" w:w="2204"/>
+            <w:tcBorders>
+              <w:top w:val="none" w:color="FFFFFF" w:sz="0"/>
+              <w:left w:val="none" w:color="FFFFFF" w:sz="0"/>
+              <w:bottom w:val="none" w:color="FFFFFF" w:sz="0"/>
+              <w:right w:val="none" w:color="FFFFFF" w:sz="0"/>
+            </w:tcBorders>
+            <w:tcMar>
+              <w:top w:type="dxa" w:w="60"/>
+              <w:left w:type="dxa" w:w="80"/>
+              <w:bottom w:type="dxa" w:w="60"/>
+              <w:right w:type="dxa" w:w="80"/>
+            </w:tcMar>
+            <w:vAlign w:val="top"/>
+          </w:tcPr>
+          <w:p>
+            <w:pPr>
+              <w:keepNext w:val="false"/>
+              <w:spacing w:after="0" w:line="240" w:lineRule="auto"/>
+            </w:pPr>
+            <w:r>
+              <w:rPr>
+                <w:b w:val="false"/>
+                <w:bCs w:val="false"/>
+                <w:sz w:val="20"/>
+                <w:szCs w:val="20"/>
+              </w:rPr>
+              <w:t xml:space="preserve">Caída de Redis (45 s)</w:t>
+            </w:r>
+          </w:p>
+        </w:tc>
+        <w:tc>
+          <w:tcPr>
+            <w:tcW w:type="dxa" w:w="3702"/>
+            <w:tcBorders>
+              <w:top w:val="none" w:color="FFFFFF" w:sz="0"/>
+              <w:left w:val="none" w:color="FFFFFF" w:sz="0"/>
+              <w:bottom w:val="none" w:color="FFFFFF" w:sz="0"/>
+              <w:right w:val="none" w:color="FFFFFF" w:sz="0"/>
+            </w:tcBorders>
+            <w:tcMar>
+              <w:top w:type="dxa" w:w="60"/>
+              <w:left w:type="dxa" w:w="80"/>
+              <w:bottom w:type="dxa" w:w="60"/>
+              <w:right w:type="dxa" w:w="80"/>
+            </w:tcMar>
+            <w:vAlign w:val="top"/>
+          </w:tcPr>
+          <w:p>
+            <w:pPr>
+              <w:keepNext w:val="false"/>
+              <w:spacing w:after="0" w:line="240" w:lineRule="auto"/>
+            </w:pPr>
+            <w:r>
+              <w:rPr>
+                <w:b w:val="false"/>
+                <w:bCs w:val="false"/>
+                <w:sz w:val="20"/>
+                <w:szCs w:val="20"/>
+              </w:rPr>
+              <w:t xml:space="preserve">Se detuvo solo Redis durante el escenario de disparos</w:t>
+            </w:r>
+          </w:p>
+        </w:tc>
+        <w:tc>
+          <w:tcPr>
+            <w:tcW w:type="dxa" w:w="3454"/>
+            <w:tcBorders>
+              <w:top w:val="none" w:color="FFFFFF" w:sz="0"/>
+              <w:left w:val="none" w:color="FFFFFF" w:sz="0"/>
+              <w:bottom w:val="none" w:color="FFFFFF" w:sz="0"/>
+              <w:right w:val="none" w:color="FFFFFF" w:sz="0"/>
+            </w:tcBorders>
+            <w:tcMar>
+              <w:top w:type="dxa" w:w="60"/>
+              <w:left w:type="dxa" w:w="80"/>
+              <w:bottom w:type="dxa" w:w="60"/>
+              <w:right w:type="dxa" w:w="80"/>
+            </w:tcMar>
+            <w:vAlign w:val="top"/>
+          </w:tcPr>
+          <w:p>
+            <w:pPr>
+              <w:keepNext w:val="false"/>
+              <w:spacing w:after="0" w:line="240" w:lineRule="auto"/>
+            </w:pPr>
+            <w:r>
+              <w:rPr>
+                <w:b w:val="false"/>
+                <w:bCs w:val="false"/>
+                <w:sz w:val="20"/>
+                <w:szCs w:val="20"/>
+              </w:rPr>
+              <w:t xml:space="preserve">Ningún mensaje fue a la cola de mensajes muertos; la alerta se generó al volver Redis</w:t>
+            </w:r>
+          </w:p>
+        </w:tc>
+      </w:tr>
+      <w:tr>
+        <w:trPr>
+          <w:tblHeader w:val="false"/>
+        </w:trPr>
+        <w:tc>
+          <w:tcPr>
+            <w:tcW w:type="dxa" w:w="2204"/>
+            <w:tcBorders>
+              <w:top w:val="none" w:color="FFFFFF" w:sz="0"/>
+              <w:left w:val="none" w:color="FFFFFF" w:sz="0"/>
+              <w:bottom w:val="none" w:color="FFFFFF" w:sz="0"/>
+              <w:right w:val="none" w:color="FFFFFF" w:sz="0"/>
+            </w:tcBorders>
+            <w:tcMar>
+              <w:top w:type="dxa" w:w="60"/>
+              <w:left w:type="dxa" w:w="80"/>
+              <w:bottom w:type="dxa" w:w="60"/>
+              <w:right w:type="dxa" w:w="80"/>
+            </w:tcMar>
+            <w:vAlign w:val="top"/>
+          </w:tcPr>
+          <w:p>
+            <w:pPr>
+              <w:keepNext w:val="false"/>
+              <w:spacing w:after="0" w:line="240" w:lineRule="auto"/>
+            </w:pPr>
+            <w:r>
+              <w:rPr>
+                <w:b w:val="false"/>
+                <w:bCs w:val="false"/>
+                <w:sz w:val="20"/>
+                <w:szCs w:val="20"/>
+              </w:rPr>
+              <w:t xml:space="preserve">Terminación abrupta del simulador</w:t>
+            </w:r>
+          </w:p>
+        </w:tc>
+        <w:tc>
+          <w:tcPr>
+            <w:tcW w:type="dxa" w:w="3702"/>
+            <w:tcBorders>
+              <w:top w:val="none" w:color="FFFFFF" w:sz="0"/>
+              <w:left w:val="none" w:color="FFFFFF" w:sz="0"/>
+              <w:bottom w:val="none" w:color="FFFFFF" w:sz="0"/>
+              <w:right w:val="none" w:color="FFFFFF" w:sz="0"/>
+            </w:tcBorders>
+            <w:tcMar>
+              <w:top w:type="dxa" w:w="60"/>
+              <w:left w:type="dxa" w:w="80"/>
+              <w:bottom w:type="dxa" w:w="60"/>
+              <w:right w:type="dxa" w:w="80"/>
+            </w:tcMar>
+            <w:vAlign w:val="top"/>
+          </w:tcPr>
+          <w:p>
+            <w:pPr>
+              <w:keepNext w:val="false"/>
+              <w:spacing w:after="0" w:line="240" w:lineRule="auto"/>
+            </w:pPr>
+            <w:r>
+              <w:rPr>
+                <w:b w:val="false"/>
+                <w:bCs w:val="false"/>
+                <w:sz w:val="20"/>
+                <w:szCs w:val="20"/>
+              </w:rPr>
+              <w:t xml:space="preserve">Se detuvo Kafka y se terminó el proceso del simulador con kill -9</w:t>
+            </w:r>
+          </w:p>
+        </w:tc>
+        <w:tc>
+          <w:tcPr>
+            <w:tcW w:type="dxa" w:w="3454"/>
+            <w:tcBorders>
+              <w:top w:val="none" w:color="FFFFFF" w:sz="0"/>
+              <w:left w:val="none" w:color="FFFFFF" w:sz="0"/>
+              <w:bottom w:val="none" w:color="FFFFFF" w:sz="0"/>
+              <w:right w:val="none" w:color="FFFFFF" w:sz="0"/>
+            </w:tcBorders>
+            <w:tcMar>
+              <w:top w:type="dxa" w:w="60"/>
+              <w:left w:type="dxa" w:w="80"/>
+              <w:bottom w:type="dxa" w:w="60"/>
+              <w:right w:type="dxa" w:w="80"/>
+            </w:tcMar>
+            <w:vAlign w:val="top"/>
+          </w:tcPr>
+          <w:p>
+            <w:pPr>
+              <w:keepNext w:val="false"/>
+              <w:spacing w:after="0" w:line="240" w:lineRule="auto"/>
+            </w:pPr>
+            <w:r>
+              <w:rPr>
+                <w:b w:val="false"/>
+                <w:bCs w:val="false"/>
+                <w:sz w:val="20"/>
+                <w:szCs w:val="20"/>
+              </w:rPr>
+              <w:t xml:space="preserve">Al reiniciar, el diario en disco recuperó el evento pendiente y se generó su alerta</w:t>
+            </w:r>
+          </w:p>
+        </w:tc>
+      </w:tr>
+      <w:tr>
+        <w:trPr>
+          <w:tblHeader w:val="false"/>
+        </w:trPr>
+        <w:tc>
+          <w:tcPr>
+            <w:tcW w:type="dxa" w:w="2204"/>
+            <w:tcBorders>
+              <w:top w:val="none" w:color="FFFFFF" w:sz="0"/>
+              <w:left w:val="none" w:color="FFFFFF" w:sz="0"/>
+              <w:bottom w:val="none" w:color="FFFFFF" w:sz="0"/>
+              <w:right w:val="none" w:color="FFFFFF" w:sz="0"/>
+            </w:tcBorders>
+            <w:tcMar>
+              <w:top w:type="dxa" w:w="60"/>
+              <w:left w:type="dxa" w:w="80"/>
+              <w:bottom w:type="dxa" w:w="60"/>
+              <w:right w:type="dxa" w:w="80"/>
+            </w:tcMar>
+            <w:vAlign w:val="top"/>
+          </w:tcPr>
+          <w:p>
+            <w:pPr>
+              <w:keepNext w:val="false"/>
+              <w:spacing w:after="0" w:line="240" w:lineRule="auto"/>
+            </w:pPr>
+            <w:r>
+              <w:rPr>
+                <w:b w:val="false"/>
+                <w:bCs w:val="false"/>
+                <w:sz w:val="20"/>
+                <w:szCs w:val="20"/>
+              </w:rPr>
+              <w:t xml:space="preserve">Mensajes inválidos</w:t>
+            </w:r>
+          </w:p>
+        </w:tc>
+        <w:tc>
+          <w:tcPr>
+            <w:tcW w:type="dxa" w:w="3702"/>
+            <w:tcBorders>
+              <w:top w:val="none" w:color="FFFFFF" w:sz="0"/>
+              <w:left w:val="none" w:color="FFFFFF" w:sz="0"/>
+              <w:bottom w:val="none" w:color="FFFFFF" w:sz="0"/>
+              <w:right w:val="none" w:color="FFFFFF" w:sz="0"/>
+            </w:tcBorders>
+            <w:tcMar>
+              <w:top w:type="dxa" w:w="60"/>
+              <w:left w:type="dxa" w:w="80"/>
+              <w:bottom w:type="dxa" w:w="60"/>
+              <w:right w:type="dxa" w:w="80"/>
+            </w:tcMar>
+            <w:vAlign w:val="top"/>
+          </w:tcPr>
+          <w:p>
+            <w:pPr>
+              <w:keepNext w:val="false"/>
+              <w:spacing w:after="0" w:line="240" w:lineRule="auto"/>
+            </w:pPr>
+            <w:r>
+              <w:rPr>
+                <w:b w:val="false"/>
+                <w:bCs w:val="false"/>
+                <w:sz w:val="20"/>
+                <w:szCs w:val="20"/>
+              </w:rPr>
+              <w:t xml:space="preserve">Inyección de tres mensajes con la herramienta de línea de comandos de Kafka</w:t>
+            </w:r>
+          </w:p>
+        </w:tc>
+        <w:tc>
+          <w:tcPr>
+            <w:tcW w:type="dxa" w:w="3454"/>
+            <w:tcBorders>
+              <w:top w:val="none" w:color="FFFFFF" w:sz="0"/>
+              <w:left w:val="none" w:color="FFFFFF" w:sz="0"/>
+              <w:bottom w:val="none" w:color="FFFFFF" w:sz="0"/>
+              <w:right w:val="none" w:color="FFFFFF" w:sz="0"/>
+            </w:tcBorders>
+            <w:tcMar>
+              <w:top w:type="dxa" w:w="60"/>
+              <w:left w:type="dxa" w:w="80"/>
+              <w:bottom w:type="dxa" w:w="60"/>
+              <w:right w:type="dxa" w:w="80"/>
+            </w:tcMar>
+            <w:vAlign w:val="top"/>
+          </w:tcPr>
+          <w:p>
+            <w:pPr>
+              <w:keepNext w:val="false"/>
+              <w:spacing w:after="0" w:line="240" w:lineRule="auto"/>
+            </w:pPr>
+            <w:r>
+              <w:rPr>
+                <w:b w:val="false"/>
+                <w:bCs w:val="false"/>
+                <w:sz w:val="20"/>
+                <w:szCs w:val="20"/>
+              </w:rPr>
+              <w:t xml:space="preserve">Los tres llegaron a la cola de mensajes muertos clasificados como permanentes, sin reintentos y sin afectar el resto del flujo</w:t>
+            </w:r>
+          </w:p>
+        </w:tc>
+      </w:tr>
+      <w:tr>
+        <w:trPr>
+          <w:tblHeader w:val="false"/>
+        </w:trPr>
+        <w:tc>
+          <w:tcPr>
+            <w:tcW w:type="dxa" w:w="2204"/>
             <w:tcBorders>
               <w:top w:val="none" w:color="FFFFFF" w:sz="0"/>
               <w:left w:val="none" w:color="FFFFFF" w:sz="0"/>
@@ -11800,7 +12122,7 @@
         </w:tc>
         <w:tc>
           <w:tcPr>
-            <w:tcW w:type="dxa" w:w="3965"/>
+            <w:tcW w:type="dxa" w:w="3702"/>
             <w:tcBorders>
               <w:top w:val="none" w:color="FFFFFF" w:sz="0"/>
               <w:left w:val="none" w:color="FFFFFF" w:sz="0"/>
@@ -11833,7 +12155,7 @@
         </w:tc>
         <w:tc>
           <w:tcPr>
-            <w:tcW w:type="dxa" w:w="3649"/>
+            <w:tcW w:type="dxa" w:w="3454"/>
             <w:tcBorders>
               <w:top w:val="none" w:color="FFFFFF" w:sz="0"/>
               <w:left w:val="none" w:color="FFFFFF" w:sz="0"/>
@@ -11884,7 +12206,7 @@
           <w:sz w:val="20"/>
           <w:szCs w:val="20"/>
         </w:rPr>
-        <w:t xml:space="preserve">Elaboración propia.</w:t>
+        <w:t xml:space="preserve">Las caídas de nodos se provocaron con el comando caida del script centinela.cmd, con tráfico de fondo y la consola del operador abierta en un navegador automatizado. Elaboración propia.</w:t>
       </w:r>
     </w:p>
     <w:p>
@@ -11913,7 +12235,17 @@
         <w:jc w:val="both"/>
       </w:pPr>
       <w:r>
-        <w:t xml:space="preserve">Probar los escenarios de falla, y no solo el camino feliz, permitió descubrir y corregir cuatro defectos reales. En la primera prueba de caída de Kafka, el buffer en disco no podía escribirse porque el volumen se creaba con permisos de administrador y la aplicación corre sin privilegios. Al repetir el escenario de robo, el seguimiento de la placa no generaba alertas en zonas ya visitadas por un incidente anterior, porque el registro de zonas era por placa y no por incidente. Un incidente abierto absorbía nueva evidencia sin informarlo al operador, lo que motivó una nueva revisión de tipo «actualizada». Y la corroboración tardía registraba una latencia falsa que activó la degradación sin sobrecarga real. Cada corrección se acompañó de una prueba automatizada o de una nueva ejecución de la validación.</w:t>
+        <w:t xml:space="preserve">Probar los escenarios de falla, y no solo el camino feliz, permitió descubrir y corregir defectos reales en dos rondas. En la primera se encontraron cuatro. En la primera prueba de caída de Kafka, el buffer en disco no podía escribirse porque el volumen se creaba con permisos de administrador y la aplicación corre sin privilegios. Al repetir el escenario de robo, el seguimiento de la placa no generaba alertas en zonas ya visitadas por un incidente anterior, porque el registro de zonas era por placa y no por incidente. Un incidente abierto absorbía nueva evidencia sin informarlo al operador, lo que motivó una nueva revisión de tipo «actualizada». Y la corroboración tardía registraba una latencia falsa que activó la degradación sin sobrecarga real. Cada corrección se acompañó de una prueba automatizada o de una nueva ejecución de la validación.</w:t>
+      </w:r>
+    </w:p>
+    <w:p>
+      <w:pPr>
+        <w:spacing w:after="0" w:line="360" w:lineRule="auto"/>
+        <w:ind w:firstLine="720"/>
+        <w:jc w:val="both"/>
+      </w:pPr>
+      <w:r>
+        <w:t xml:space="preserve">En la segunda ronda se apagó de verdad cada servidor, lo que reveló ocho brechas entre lo que prometía la política de resiliencia y lo que hacía el sistema. Las más visibles fueron que, al volver el nodo A, la lista de placas robadas quedaba vacía hasta diez minutos; que un robo ocurrido durante la caída del nodo A se clasificaba como posible falso positivo, porque solo se guardaba el pánico y no la telemetría que lo corroboraba; que nadie anunciaba la caída del nodo B, ya que la consola era justamente lo que había caído; y que, al recuperarse, el monitor de SLO confundía la puesta al día con una sobrecarga y activaba la degradación. Las otras cuatro se encontraron leyendo el código: el buffer se escribía solo después de que el envío fallaba, la pasarela de la aplicación móvil no tenía buffer, lo que agotaba los reintentos iba a la cola de mensajes muertos sin que nada lo reprocesara y no había respaldo de la base de datos. Todas se corrigieron con los mecanismos descritos en la sección 6.4 y se volvieron a probar con los resultados de la Tabla 9.</w:t>
       </w:r>
     </w:p>
     <w:p>
@@ -12650,7 +12982,7 @@
         <w:jc w:val="both"/>
       </w:pPr>
       <w:r>
-        <w:t xml:space="preserve">Las pruebas de falla resultaron tan importantes como las funcionales: revelaron cuatro defectos reales que no aparecían en el camino feliz.</w:t>
+        <w:t xml:space="preserve">Las pruebas de falla resultaron tan importantes como las funcionales: revelaron doce defectos y brechas que no aparecían en el camino feliz. Separar el estado (nodo A) del cómputo (nodo B) hace que la caída del servidor de servicios solo produzca retraso, mientras que la del servidor de datos, el punto único de falla aceptado para el alcance académico, no provoca la pérdida de ningún evento crítico gracias a la escritura anticipada en disco.</w:t>
       </w:r>
     </w:p>
     <w:p>
@@ -12673,7 +13005,7 @@
         <w:jc w:val="both"/>
       </w:pPr>
       <w:r>
-        <w:t xml:space="preserve">Para producción, desplegar tres brokers de Kafka con replicación, una réplica de PostgreSQL, cifrado TLS, autenticación SASL con listas de control de acceso e integración con el directorio de usuarios municipal.</w:t>
+        <w:t xml:space="preserve">Para producción, eliminar el punto único de falla del nodo A con tres brokers de Kafka con factor de replicación tres, una réplica de PostgreSQL y Redis con Sentinel, y agregar cifrado TLS, autenticación SASL con listas de control de acceso e integración con el directorio de usuarios municipal.</w:t>
       </w:r>
     </w:p>
     <w:p>
@@ -13107,7 +13439,7 @@
         <w:t xml:space="preserve">Anexo B. Configuración técnica y manuales.</w:t>
       </w:r>
       <w:r>
-        <w:t xml:space="preserve"> El repositorio del proyecto contiene la configuración de servicios y contenedores (archivos Docker Compose por nodo y archivos de configuración de cada servicio), los scripts de simulación de eventos, la documentación del sistema de correlación, el manual de operación con el guion de la puesta en simulación y la guía de despliegue en varias máquinas.</w:t>
+        <w:t xml:space="preserve"> El repositorio del proyecto contiene la configuración de servicios y contenedores (archivos Docker Compose por nodo y archivos de configuración de cada servicio), el script centinela.cmd para instalar y operar todo desde Windows, los scripts de simulación de eventos, la documentación del sistema de correlación, el manual de operación con el guion de la puesta en simulación y la guía de despliegue en varias máquinas.</w:t>
       </w:r>
     </w:p>
     <w:sectPr>

</xml_diff>